<commit_message>
feat!: retire filters fixed in apaquarto v7.0.0; release 0.2.0
Closes #15, closes #16, closes #17. Vendored apaquarto is now the v7.0.0
release. Removes docx-tables.lua, jou-float-notes.lua and the Needspace half
of latex-header.lua, with the checks that guarded them.

Co-Authored-By: Claude Sonnet 5.5 <noreply@anthropic.com>
</commit_message>
<xml_diff>
--- a/tests/vendor/wjschne/apaquarto/apaquarto.docx
+++ b/tests/vendor/wjschne/apaquarto/apaquarto.docx
@@ -122,7 +122,7 @@
       </w:sdtPr>
       <w:sdtContent>
         <w:r>
-          <w:t xml:space="preserve">PROBABILITY OF MEDIATED SHIFT</w:t>
+          <w:t xml:space="preserve">SHORT TITLE IN RUNNING HEADER</w:t>
         </w:r>
       </w:sdtContent>
     </w:sdt>
@@ -1179,9 +1179,9 @@
     <w:uiPriority w:val="9"/>
     <w:unhideWhenUsed/>
     <w:qFormat/>
-    <w:rsid w:val="0017682D"/>
-    <w:pPr>
-      <w:ind w:left="720" w:right="720" w:firstLine="0"/>
+    <w:rsid w:val="0056007C"/>
+    <w:pPr>
+      <w:ind w:left="720" w:firstLine="0"/>
     </w:pPr>
   </w:style>
   <w:style w:type="paragraph" w:styleId="FootnoteText">
@@ -1933,7 +1933,7 @@
     <w:basedOn w:val="BodyTextChar"/>
     <w:link w:val="BlockText"/>
     <w:uiPriority w:val="9"/>
-    <w:rsid w:val="00065938"/>
+    <w:rsid w:val="0056007C"/>
   </w:style>
   <w:style w:type="character" w:customStyle="1" w:styleId="NextBlockTextChar">
     <w:name w:val="NextBlockText Char"/>
@@ -2061,6 +2061,13 @@
     <w:qFormat/>
     <w:pPr>
       <w:outlineLvl w:val="9"/>
+    </w:pPr>
+  </w:style>
+  <w:style w:type="paragraph" w:customStyle="1" w:styleId="QuoteAttribution">
+    <w:name w:val="QuoteAttribution"/>
+    <w:basedOn w:val="BlockText"/>
+    <w:pPr>
+      <w:jc w:val="right"/>
     </w:pPr>
   </w:style>
 </w:styles>
@@ -2160,6 +2167,7 @@
     <w:rsid w:val="00221DB6"/>
     <w:rsid w:val="00266742"/>
     <w:rsid w:val="002E7A3C"/>
+    <w:rsid w:val="003106FC"/>
     <w:rsid w:val="003402EC"/>
     <w:rsid w:val="00440287"/>
     <w:rsid w:val="004739F0"/>
@@ -2168,6 +2176,7 @@
     <w:rsid w:val="005B1707"/>
     <w:rsid w:val="005C0DD9"/>
     <w:rsid w:val="0061553F"/>
+    <w:rsid w:val="006F54D0"/>
     <w:rsid w:val="007139D3"/>
     <w:rsid w:val="00843AF0"/>
     <w:rsid w:val="0088292B"/>

</xml_diff>

<commit_message>
feat!: retire filters fixed in apaquarto v7.0.0; release 0.2.0 (#18)
Closes #15, closes #16, closes #17. Vendored apaquarto is now the v7.0.0
release. Removes docx-tables.lua, jou-float-notes.lua and the Needspace half
of latex-header.lua, with the checks that guarded them.

Co-authored-by: Claude Sonnet 5.5 <noreply@anthropic.com>
</commit_message>
<xml_diff>
--- a/tests/vendor/wjschne/apaquarto/apaquarto.docx
+++ b/tests/vendor/wjschne/apaquarto/apaquarto.docx
@@ -122,7 +122,7 @@
       </w:sdtPr>
       <w:sdtContent>
         <w:r>
-          <w:t xml:space="preserve">PROBABILITY OF MEDIATED SHIFT</w:t>
+          <w:t xml:space="preserve">SHORT TITLE IN RUNNING HEADER</w:t>
         </w:r>
       </w:sdtContent>
     </w:sdt>
@@ -1179,9 +1179,9 @@
     <w:uiPriority w:val="9"/>
     <w:unhideWhenUsed/>
     <w:qFormat/>
-    <w:rsid w:val="0017682D"/>
-    <w:pPr>
-      <w:ind w:left="720" w:right="720" w:firstLine="0"/>
+    <w:rsid w:val="0056007C"/>
+    <w:pPr>
+      <w:ind w:left="720" w:firstLine="0"/>
     </w:pPr>
   </w:style>
   <w:style w:type="paragraph" w:styleId="FootnoteText">
@@ -1933,7 +1933,7 @@
     <w:basedOn w:val="BodyTextChar"/>
     <w:link w:val="BlockText"/>
     <w:uiPriority w:val="9"/>
-    <w:rsid w:val="00065938"/>
+    <w:rsid w:val="0056007C"/>
   </w:style>
   <w:style w:type="character" w:customStyle="1" w:styleId="NextBlockTextChar">
     <w:name w:val="NextBlockText Char"/>
@@ -2061,6 +2061,13 @@
     <w:qFormat/>
     <w:pPr>
       <w:outlineLvl w:val="9"/>
+    </w:pPr>
+  </w:style>
+  <w:style w:type="paragraph" w:customStyle="1" w:styleId="QuoteAttribution">
+    <w:name w:val="QuoteAttribution"/>
+    <w:basedOn w:val="BlockText"/>
+    <w:pPr>
+      <w:jc w:val="right"/>
     </w:pPr>
   </w:style>
 </w:styles>
@@ -2160,6 +2167,7 @@
     <w:rsid w:val="00221DB6"/>
     <w:rsid w:val="00266742"/>
     <w:rsid w:val="002E7A3C"/>
+    <w:rsid w:val="003106FC"/>
     <w:rsid w:val="003402EC"/>
     <w:rsid w:val="00440287"/>
     <w:rsid w:val="004739F0"/>
@@ -2168,6 +2176,7 @@
     <w:rsid w:val="005B1707"/>
     <w:rsid w:val="005C0DD9"/>
     <w:rsid w:val="0061553F"/>
+    <w:rsid w:val="006F54D0"/>
     <w:rsid w:val="007139D3"/>
     <w:rsid w:val="00843AF0"/>
     <w:rsid w:val="0088292B"/>

</xml_diff>